<commit_message>
runbook：git clean 必须排除宝塔生成的 .user.ini 与 .htaccess
甲方按第 1c-新 节跑了预演，结果只有三行，而且三个都不是构建残留：
out/.user.ini、out-rayen/.user.ini、out/.htaccess —— 全是宝塔面板给站点目录
自己生成的配置（.user.ini 放 PHP 的 open_basedir，.htaccess 是伪静态规则）。

宝塔通常还给 .user.ini 加了 chattr +i 不可修改属性，所以 git clean 删它会失败
并中断整条命令，后面的 reset 和验证都不会执行 —— 用户会看到一个报错，
以为是自己操作错了，实际上是这条命令本来就不该碰这两个文件。

所以命令改成 git clean -fd -e .user.ini -e .htaccess，并把实测的预演输出直接
写进文档，让读者有个可对照的样子，而不是只有一句「应该全是自动生成的文件」。

预演那一段的描述也改了：原文写「应该全是 out/、content/products/ 里的文件」，
而实测只有三行，两者对不上会让读者以为自己少跑了什么。

Co-Authored-By: Claude Opus 5 <noreply@anthropic.com>
</commit_message>
<xml_diff>
--- a/docs/hyde/HYDE-操作手册-CLIENT-RUNBOOK-2026-09-10.docx
+++ b/docs/hyde/HYDE-操作手册-CLIENT-RUNBOOK-2026-09-10.docx
@@ -4013,89 +4013,16 @@
       <w:r>
         <w:rPr>
           <w:rFonts w:ascii="Microsoft YaHei" w:cs="Microsoft YaHei" w:eastAsia="Microsoft YaHei" w:hAnsi="Microsoft YaHei"/>
-        </w:rPr>
-        <w:t xml:space="preserve">列出来的应该全是 </w:t>
-      </w:r>
-      <w:r>
-        <w:rPr>
-          <w:rFonts w:ascii="Consolas" w:cs="Consolas" w:eastAsia="Consolas" w:hAnsi="Consolas"/>
-          <w:shd w:fill="F2F2F2" w:val="clear"/>
-        </w:rPr>
-        <w:t xml:space="preserve">out/</w:t>
-      </w:r>
-      <w:r>
-        <w:rPr>
-          <w:rFonts w:ascii="Microsoft YaHei" w:cs="Microsoft YaHei" w:eastAsia="Microsoft YaHei" w:hAnsi="Microsoft YaHei"/>
-        </w:rPr>
-        <w:t xml:space="preserve">、</w:t>
-      </w:r>
-      <w:r>
-        <w:rPr>
-          <w:rFonts w:ascii="Consolas" w:cs="Consolas" w:eastAsia="Consolas" w:hAnsi="Consolas"/>
-          <w:shd w:fill="F2F2F2" w:val="clear"/>
-        </w:rPr>
-        <w:t xml:space="preserve">out-rayen/</w:t>
-      </w:r>
-      <w:r>
-        <w:rPr>
-          <w:rFonts w:ascii="Microsoft YaHei" w:cs="Microsoft YaHei" w:eastAsia="Microsoft YaHei" w:hAnsi="Microsoft YaHei"/>
-        </w:rPr>
-        <w:t xml:space="preserve">、</w:t>
-      </w:r>
-      <w:r>
-        <w:rPr>
-          <w:rFonts w:ascii="Consolas" w:cs="Consolas" w:eastAsia="Consolas" w:hAnsi="Consolas"/>
-          <w:shd w:fill="F2F2F2" w:val="clear"/>
-        </w:rPr>
-        <w:t xml:space="preserve">content/products/</w:t>
-      </w:r>
-      <w:r>
-        <w:rPr>
-          <w:rFonts w:ascii="Microsoft YaHei" w:cs="Microsoft YaHei" w:eastAsia="Microsoft YaHei" w:hAnsi="Microsoft YaHei"/>
-        </w:rPr>
-        <w:t xml:space="preserve">、</w:t>
-      </w:r>
-    </w:p>
-    <w:p>
-      <w:pPr>
-        <w:spacing w:after="60" w:before="60"/>
-      </w:pPr>
-      <w:r>
-        <w:rPr>
-          <w:rFonts w:ascii="Consolas" w:cs="Consolas" w:eastAsia="Consolas" w:hAnsi="Consolas"/>
-          <w:shd w:fill="F2F2F2" w:val="clear"/>
-        </w:rPr>
-        <w:t xml:space="preserve">docs/design-references/</w:t>
-      </w:r>
-      <w:r>
-        <w:rPr>
-          <w:rFonts w:ascii="Microsoft YaHei" w:cs="Microsoft YaHei" w:eastAsia="Microsoft YaHei" w:hAnsi="Microsoft YaHei"/>
-        </w:rPr>
-        <w:t xml:space="preserve"> 里的文件。**如果你看到任何不像自动生成的东西</w:t>
-      </w:r>
-    </w:p>
-    <w:p>
-      <w:pPr>
-        <w:spacing w:after="60" w:before="60"/>
-      </w:pPr>
-      <w:r>
-        <w:rPr>
-          <w:rFonts w:ascii="Microsoft YaHei" w:cs="Microsoft YaHei" w:eastAsia="Microsoft YaHei" w:hAnsi="Microsoft YaHei"/>
-        </w:rPr>
-        <w:t xml:space="preserve">——比如你自己上传的照片、你自己写的文件——停下来发我截图。**</w:t>
-      </w:r>
-    </w:p>
-    <w:p>
-      <w:pPr>
-        <w:spacing w:after="60" w:before="60"/>
-      </w:pPr>
-      <w:r>
-        <w:rPr>
-          <w:rFonts w:ascii="Microsoft YaHei" w:cs="Microsoft YaHei" w:eastAsia="Microsoft YaHei" w:hAnsi="Microsoft YaHei"/>
-          <w:b/>
-          <w:bCs/>
-        </w:rPr>
-        <w:t xml:space="preserve">第二步：确认没问题之后，三行命令：</w:t>
+          <w:b/>
+          <w:bCs/>
+        </w:rPr>
+        <w:t xml:space="preserve">2026-09-10 实测的结果是只有三行</w:t>
+      </w:r>
+      <w:r>
+        <w:rPr>
+          <w:rFonts w:ascii="Microsoft YaHei" w:cs="Microsoft YaHei" w:eastAsia="Microsoft YaHei" w:hAnsi="Microsoft YaHei"/>
+        </w:rPr>
+        <w:t xml:space="preserve">，而且三个都是宝塔生成的配置文件：</w:t>
       </w:r>
     </w:p>
     <w:p>
@@ -4110,7 +4037,7 @@
           <w:sz w:val="20"/>
           <w:szCs w:val="20"/>
         </w:rPr>
-        <w:t xml:space="preserve">cd /www/wwwroot/cantonlock.com</w:t>
+        <w:t xml:space="preserve">Would remove out-rayen/.user.ini</w:t>
       </w:r>
     </w:p>
     <w:p>
@@ -4125,7 +4052,7 @@
           <w:sz w:val="20"/>
           <w:szCs w:val="20"/>
         </w:rPr>
-        <w:t xml:space="preserve">git fetch origin &amp;&amp; git reset --hard origin/main &amp;&amp; git clean -fd</w:t>
+        <w:t xml:space="preserve">Would remove out/.htaccess</w:t>
       </w:r>
     </w:p>
     <w:p>
@@ -4140,7 +4067,329 @@
           <w:sz w:val="20"/>
           <w:szCs w:val="20"/>
         </w:rPr>
+        <w:t xml:space="preserve">Would remove out/.user.ini</w:t>
+      </w:r>
+    </w:p>
+    <w:p>
+      <w:pPr>
+        <w:spacing w:after="60" w:before="60"/>
+      </w:pPr>
+      <w:r>
+        <w:rPr>
+          <w:rFonts w:ascii="Microsoft YaHei" w:cs="Microsoft YaHei" w:eastAsia="Microsoft YaHei" w:hAnsi="Microsoft YaHei"/>
+          <w:b/>
+          <w:bCs/>
+        </w:rPr>
+        <w:t xml:space="preserve">看到的和这个差不多就继续。</w:t>
+      </w:r>
+      <w:r>
+        <w:rPr>
+          <w:rFonts w:ascii="Microsoft YaHei" w:cs="Microsoft YaHei" w:eastAsia="Microsoft YaHei" w:hAnsi="Microsoft YaHei"/>
+        </w:rPr>
+        <w:t xml:space="preserve"> 如果列出了几十上百个 </w:t>
+      </w:r>
+      <w:r>
+        <w:rPr>
+          <w:rFonts w:ascii="Consolas" w:cs="Consolas" w:eastAsia="Consolas" w:hAnsi="Consolas"/>
+          <w:shd w:fill="F2F2F2" w:val="clear"/>
+        </w:rPr>
+        <w:t xml:space="preserve">out/</w:t>
+      </w:r>
+      <w:r>
+        <w:rPr>
+          <w:rFonts w:ascii="Microsoft YaHei" w:cs="Microsoft YaHei" w:eastAsia="Microsoft YaHei" w:hAnsi="Microsoft YaHei"/>
+        </w:rPr>
+        <w:t xml:space="preserve"> 或</w:t>
+      </w:r>
+    </w:p>
+    <w:p>
+      <w:pPr>
+        <w:spacing w:after="60" w:before="60"/>
+      </w:pPr>
+      <w:r>
+        <w:rPr>
+          <w:rFonts w:ascii="Consolas" w:cs="Consolas" w:eastAsia="Consolas" w:hAnsi="Consolas"/>
+          <w:shd w:fill="F2F2F2" w:val="clear"/>
+        </w:rPr>
+        <w:t xml:space="preserve">content/products/</w:t>
+      </w:r>
+      <w:r>
+        <w:rPr>
+          <w:rFonts w:ascii="Microsoft YaHei" w:cs="Microsoft YaHei" w:eastAsia="Microsoft YaHei" w:hAnsi="Microsoft YaHei"/>
+        </w:rPr>
+        <w:t xml:space="preserve"> 里的文件，也是正常的（那是旧构建残留）。</w:t>
+      </w:r>
+    </w:p>
+    <w:p>
+      <w:pPr>
+        <w:spacing w:after="60" w:before="60"/>
+      </w:pPr>
+      <w:r>
+        <w:rPr>
+          <w:rFonts w:ascii="Microsoft YaHei" w:cs="Microsoft YaHei" w:eastAsia="Microsoft YaHei" w:hAnsi="Microsoft YaHei"/>
+        </w:rPr>
+        <w:t xml:space="preserve">**但只要看到任何不像自动生成的东西 —— 你自己上传的照片、你自己写的文件 ——</w:t>
+      </w:r>
+    </w:p>
+    <w:p>
+      <w:pPr>
+        <w:spacing w:after="60" w:before="60"/>
+      </w:pPr>
+      <w:r>
+        <w:rPr>
+          <w:rFonts w:ascii="Microsoft YaHei" w:cs="Microsoft YaHei" w:eastAsia="Microsoft YaHei" w:hAnsi="Microsoft YaHei"/>
+        </w:rPr>
+        <w:t xml:space="preserve">就停下来发我截图。**</w:t>
+      </w:r>
+    </w:p>
+    <w:p>
+      <w:pPr>
+        <w:spacing w:after="60" w:before="60"/>
+      </w:pPr>
+      <w:r>
+        <w:rPr>
+          <w:rFonts w:ascii="Microsoft YaHei" w:cs="Microsoft YaHei" w:eastAsia="Microsoft YaHei" w:hAnsi="Microsoft YaHei"/>
+          <w:b/>
+          <w:bCs/>
+        </w:rPr>
+        <w:t xml:space="preserve">第二步：确认没问题之后，四行命令：</w:t>
+      </w:r>
+    </w:p>
+    <w:p>
+      <w:pPr>
+        <w:shd w:fill="F5F5F5" w:val="clear"/>
+        <w:spacing w:after="0" w:before="120"/>
+        <w:ind w:left="240"/>
+      </w:pPr>
+      <w:r>
+        <w:rPr>
+          <w:rFonts w:ascii="Consolas" w:cs="Consolas" w:eastAsia="Consolas" w:hAnsi="Consolas"/>
+          <w:sz w:val="20"/>
+          <w:szCs w:val="20"/>
+        </w:rPr>
+        <w:t xml:space="preserve">cd /www/wwwroot/cantonlock.com</w:t>
+      </w:r>
+    </w:p>
+    <w:p>
+      <w:pPr>
+        <w:shd w:fill="F5F5F5" w:val="clear"/>
+        <w:spacing w:after="0" w:before="0"/>
+        <w:ind w:left="240"/>
+      </w:pPr>
+      <w:r>
+        <w:rPr>
+          <w:rFonts w:ascii="Consolas" w:cs="Consolas" w:eastAsia="Consolas" w:hAnsi="Consolas"/>
+          <w:sz w:val="20"/>
+          <w:szCs w:val="20"/>
+        </w:rPr>
+        <w:t xml:space="preserve">git fetch origin</w:t>
+      </w:r>
+    </w:p>
+    <w:p>
+      <w:pPr>
+        <w:shd w:fill="F5F5F5" w:val="clear"/>
+        <w:spacing w:after="0" w:before="0"/>
+        <w:ind w:left="240"/>
+      </w:pPr>
+      <w:r>
+        <w:rPr>
+          <w:rFonts w:ascii="Consolas" w:cs="Consolas" w:eastAsia="Consolas" w:hAnsi="Consolas"/>
+          <w:sz w:val="20"/>
+          <w:szCs w:val="20"/>
+        </w:rPr>
+        <w:t xml:space="preserve">git reset --hard origin/main</w:t>
+      </w:r>
+    </w:p>
+    <w:p>
+      <w:pPr>
+        <w:shd w:fill="F5F5F5" w:val="clear"/>
+        <w:spacing w:after="0" w:before="0"/>
+        <w:ind w:left="240"/>
+      </w:pPr>
+      <w:r>
+        <w:rPr>
+          <w:rFonts w:ascii="Consolas" w:cs="Consolas" w:eastAsia="Consolas" w:hAnsi="Consolas"/>
+          <w:sz w:val="20"/>
+          <w:szCs w:val="20"/>
+        </w:rPr>
+        <w:t xml:space="preserve">git clean -fd -e .user.ini -e .htaccess</w:t>
+      </w:r>
+    </w:p>
+    <w:p>
+      <w:pPr>
+        <w:shd w:fill="F5F5F5" w:val="clear"/>
+        <w:spacing w:after="120" w:before="0"/>
+        <w:ind w:left="240"/>
+      </w:pPr>
+      <w:r>
+        <w:rPr>
+          <w:rFonts w:ascii="Consolas" w:cs="Consolas" w:eastAsia="Consolas" w:hAnsi="Consolas"/>
+          <w:sz w:val="20"/>
+          <w:szCs w:val="20"/>
+        </w:rPr>
         <w:t xml:space="preserve">git log --oneline -1</w:t>
+      </w:r>
+    </w:p>
+    <w:p>
+      <w:pPr>
+        <w:pBdr>
+          <w:left w:val="single" w:color="E0A800" w:sz="12"/>
+        </w:pBdr>
+        <w:shd w:fill="FFF8E1" w:val="clear"/>
+        <w:spacing w:after="120" w:before="120"/>
+        <w:ind w:left="240"/>
+      </w:pPr>
+      <w:r>
+        <w:rPr>
+          <w:rFonts w:ascii="Microsoft YaHei" w:cs="Microsoft YaHei" w:eastAsia="Microsoft YaHei" w:hAnsi="Microsoft YaHei"/>
+        </w:rPr>
+        <w:t xml:space="preserve">⚠ </w:t>
+      </w:r>
+      <w:r>
+        <w:rPr>
+          <w:rFonts w:ascii="Microsoft YaHei" w:cs="Microsoft YaHei" w:eastAsia="Microsoft YaHei" w:hAnsi="Microsoft YaHei"/>
+          <w:b/>
+          <w:bCs/>
+        </w:rPr>
+        <w:t xml:space="preserve">`-e .user.ini -e .htaccess` 这两个排除项不能省。</w:t>
+      </w:r>
+      <w:r>
+        <w:rPr>
+          <w:rFonts w:ascii="Microsoft YaHei" w:cs="Microsoft YaHei" w:eastAsia="Microsoft YaHei" w:hAnsi="Microsoft YaHei"/>
+        </w:rPr>
+        <w:t xml:space="preserve">  2026-09-10 实测，服务器上唯一的未跟踪文件就是这三个： </w:t>
+      </w:r>
+      <w:r>
+        <w:rPr>
+          <w:rFonts w:ascii="Consolas" w:cs="Consolas" w:eastAsia="Consolas" w:hAnsi="Consolas"/>
+          <w:shd w:fill="F2F2F2" w:val="clear"/>
+        </w:rPr>
+        <w:t xml:space="preserve">out/.user.ini</w:t>
+      </w:r>
+      <w:r>
+        <w:rPr>
+          <w:rFonts w:ascii="Microsoft YaHei" w:cs="Microsoft YaHei" w:eastAsia="Microsoft YaHei" w:hAnsi="Microsoft YaHei"/>
+        </w:rPr>
+        <w:t xml:space="preserve">、</w:t>
+      </w:r>
+      <w:r>
+        <w:rPr>
+          <w:rFonts w:ascii="Consolas" w:cs="Consolas" w:eastAsia="Consolas" w:hAnsi="Consolas"/>
+          <w:shd w:fill="F2F2F2" w:val="clear"/>
+        </w:rPr>
+        <w:t xml:space="preserve">out-rayen/.user.ini</w:t>
+      </w:r>
+      <w:r>
+        <w:rPr>
+          <w:rFonts w:ascii="Microsoft YaHei" w:cs="Microsoft YaHei" w:eastAsia="Microsoft YaHei" w:hAnsi="Microsoft YaHei"/>
+        </w:rPr>
+        <w:t xml:space="preserve">、</w:t>
+      </w:r>
+      <w:r>
+        <w:rPr>
+          <w:rFonts w:ascii="Consolas" w:cs="Consolas" w:eastAsia="Consolas" w:hAnsi="Consolas"/>
+          <w:shd w:fill="F2F2F2" w:val="clear"/>
+        </w:rPr>
+        <w:t xml:space="preserve">out/.htaccess</w:t>
+      </w:r>
+      <w:r>
+        <w:rPr>
+          <w:rFonts w:ascii="Microsoft YaHei" w:cs="Microsoft YaHei" w:eastAsia="Microsoft YaHei" w:hAnsi="Microsoft YaHei"/>
+        </w:rPr>
+        <w:t xml:space="preserve">。 </w:t>
+      </w:r>
+      <w:r>
+        <w:rPr>
+          <w:rFonts w:ascii="Microsoft YaHei" w:cs="Microsoft YaHei" w:eastAsia="Microsoft YaHei" w:hAnsi="Microsoft YaHei"/>
+          <w:b/>
+          <w:bCs/>
+        </w:rPr>
+        <w:t xml:space="preserve">它们不是网站内容，是宝塔面板自己给站点目录生成的</w:t>
+      </w:r>
+      <w:r>
+        <w:rPr>
+          <w:rFonts w:ascii="Microsoft YaHei" w:cs="Microsoft YaHei" w:eastAsia="Microsoft YaHei" w:hAnsi="Microsoft YaHei"/>
+        </w:rPr>
+        <w:t xml:space="preserve"> —— </w:t>
+      </w:r>
+      <w:r>
+        <w:rPr>
+          <w:rFonts w:ascii="Consolas" w:cs="Consolas" w:eastAsia="Consolas" w:hAnsi="Consolas"/>
+          <w:shd w:fill="F2F2F2" w:val="clear"/>
+        </w:rPr>
+        <w:t xml:space="preserve">.user.ini</w:t>
+      </w:r>
+      <w:r>
+        <w:rPr>
+          <w:rFonts w:ascii="Microsoft YaHei" w:cs="Microsoft YaHei" w:eastAsia="Microsoft YaHei" w:hAnsi="Microsoft YaHei"/>
+        </w:rPr>
+        <w:t xml:space="preserve"> 放 PHP 的 open_basedir 限制，</w:t>
+      </w:r>
+      <w:r>
+        <w:rPr>
+          <w:rFonts w:ascii="Consolas" w:cs="Consolas" w:eastAsia="Consolas" w:hAnsi="Consolas"/>
+          <w:shd w:fill="F2F2F2" w:val="clear"/>
+        </w:rPr>
+        <w:t xml:space="preserve">.htaccess</w:t>
+      </w:r>
+      <w:r>
+        <w:rPr>
+          <w:rFonts w:ascii="Microsoft YaHei" w:cs="Microsoft YaHei" w:eastAsia="Microsoft YaHei" w:hAnsi="Microsoft YaHei"/>
+        </w:rPr>
+        <w:t xml:space="preserve"> 是伪静态规则。  宝塔通常还给 </w:t>
+      </w:r>
+      <w:r>
+        <w:rPr>
+          <w:rFonts w:ascii="Consolas" w:cs="Consolas" w:eastAsia="Consolas" w:hAnsi="Consolas"/>
+          <w:shd w:fill="F2F2F2" w:val="clear"/>
+        </w:rPr>
+        <w:t xml:space="preserve">.user.ini</w:t>
+      </w:r>
+      <w:r>
+        <w:rPr>
+          <w:rFonts w:ascii="Microsoft YaHei" w:cs="Microsoft YaHei" w:eastAsia="Microsoft YaHei" w:hAnsi="Microsoft YaHei"/>
+        </w:rPr>
+        <w:t xml:space="preserve"> 加了不可修改属性（</w:t>
+      </w:r>
+      <w:r>
+        <w:rPr>
+          <w:rFonts w:ascii="Consolas" w:cs="Consolas" w:eastAsia="Consolas" w:hAnsi="Consolas"/>
+          <w:shd w:fill="F2F2F2" w:val="clear"/>
+        </w:rPr>
+        <w:t xml:space="preserve">chattr +i</w:t>
+      </w:r>
+      <w:r>
+        <w:rPr>
+          <w:rFonts w:ascii="Microsoft YaHei" w:cs="Microsoft YaHei" w:eastAsia="Microsoft YaHei" w:hAnsi="Microsoft YaHei"/>
+        </w:rPr>
+        <w:t xml:space="preserve">），所以 </w:t>
+      </w:r>
+      <w:r>
+        <w:rPr>
+          <w:rFonts w:ascii="Consolas" w:cs="Consolas" w:eastAsia="Consolas" w:hAnsi="Consolas"/>
+          <w:shd w:fill="F2F2F2" w:val="clear"/>
+        </w:rPr>
+        <w:t xml:space="preserve">git clean</w:t>
+      </w:r>
+      <w:r>
+        <w:rPr>
+          <w:rFonts w:ascii="Microsoft YaHei" w:cs="Microsoft YaHei" w:eastAsia="Microsoft YaHei" w:hAnsi="Microsoft YaHei"/>
+        </w:rPr>
+        <w:t xml:space="preserve"> 删它会</w:t>
+      </w:r>
+      <w:r>
+        <w:rPr>
+          <w:rFonts w:ascii="Microsoft YaHei" w:cs="Microsoft YaHei" w:eastAsia="Microsoft YaHei" w:hAnsi="Microsoft YaHei"/>
+          <w:b/>
+          <w:bCs/>
+        </w:rPr>
+        <w:t xml:space="preserve">失败并中断整条命令</w:t>
+      </w:r>
+      <w:r>
+        <w:rPr>
+          <w:rFonts w:ascii="Microsoft YaHei" w:cs="Microsoft YaHei" w:eastAsia="Microsoft YaHei" w:hAnsi="Microsoft YaHei"/>
+        </w:rPr>
+        <w:t xml:space="preserve">，后面的验证就不会执行。 加了排除项就绕开这个坑，而且这两个文件留着对静态站没有任何副作用。</w:t>
       </w:r>
     </w:p>
     <w:p>

</xml_diff>